<commit_message>
Adiciona respostas do Apêndice A (PyTorch) ao relatório de leitura
</commit_message>
<xml_diff>
--- a/documents/Relatório de leitura.docx
+++ b/documents/Relatório de leitura.docx
@@ -32,51 +32,7 @@
           <w:sz w:val="26"/>
           <w:szCs w:val="26"/>
         </w:rPr>
-        <w:t xml:space="preserve">Build a Large </w:t>
-      </w:r>
-      <w:proofErr w:type="spellStart"/>
-      <w:r>
-        <w:rPr>
-          <w:i/>
-          <w:iCs/>
-          <w:color w:val="444444"/>
-          <w:sz w:val="26"/>
-          <w:szCs w:val="26"/>
-        </w:rPr>
-        <w:t>Language</w:t>
-      </w:r>
-      <w:proofErr w:type="spellEnd"/>
-      <w:r>
-        <w:rPr>
-          <w:i/>
-          <w:iCs/>
-          <w:color w:val="444444"/>
-          <w:sz w:val="26"/>
-          <w:szCs w:val="26"/>
-        </w:rPr>
-        <w:t xml:space="preserve"> Model (</w:t>
-      </w:r>
-      <w:proofErr w:type="spellStart"/>
-      <w:r>
-        <w:rPr>
-          <w:i/>
-          <w:iCs/>
-          <w:color w:val="444444"/>
-          <w:sz w:val="26"/>
-          <w:szCs w:val="26"/>
-        </w:rPr>
-        <w:t>From</w:t>
-      </w:r>
-      <w:proofErr w:type="spellEnd"/>
-      <w:r>
-        <w:rPr>
-          <w:i/>
-          <w:iCs/>
-          <w:color w:val="444444"/>
-          <w:sz w:val="26"/>
-          <w:szCs w:val="26"/>
-        </w:rPr>
-        <w:t xml:space="preserve"> Scratch)</w:t>
+        <w:t xml:space="preserve">Build a Large Language Model (From Scratch)</w:t>
       </w:r>
     </w:p>
     <w:p>
@@ -88,23 +44,7 @@
         <w:spacing w:before="400" w:after="200"/>
       </w:pPr>
       <w:r>
-        <w:t xml:space="preserve">Capítulo 1 — </w:t>
-      </w:r>
-      <w:proofErr w:type="spellStart"/>
-      <w:r>
-        <w:t>Understanding</w:t>
-      </w:r>
-      <w:proofErr w:type="spellEnd"/>
-      <w:r>
-        <w:t xml:space="preserve"> Large </w:t>
-      </w:r>
-      <w:proofErr w:type="spellStart"/>
-      <w:r>
-        <w:t>Language</w:t>
-      </w:r>
-      <w:proofErr w:type="spellEnd"/>
-      <w:r>
-        <w:t xml:space="preserve"> Models</w:t>
+        <w:t xml:space="preserve">Capítulo 1 — Understanding Large Language Models</w:t>
       </w:r>
     </w:p>
     <w:p>
@@ -119,9 +59,25 @@
           <w:sz w:val="22"/>
           <w:szCs w:val="22"/>
         </w:rPr>
-        <w:t xml:space="preserve">1. O que caracteriza um Large </w:t>
-      </w:r>
-      <w:proofErr w:type="spellStart"/>
+        <w:t xml:space="preserve">1. O que caracteriza um Large Language Model?</w:t>
+      </w:r>
+    </w:p>
+    <w:p>
+      <w:pPr>
+        <w:spacing w:after="200" w:line="276" w:lineRule="auto"/>
+      </w:pPr>
+      <w:r>
+        <w:rPr>
+          <w:sz w:val="22"/>
+          <w:szCs w:val="22"/>
+        </w:rPr>
+        <w:t xml:space="preserve">É uma rede neural profunda treinada em quantidades massivas de texto para prever a próxima palavra em uma sequência. O "large" se refere tanto ao número de parâmetros (dezenas a centenas de bilhões) quanto ao tamanho do dataset de treino. Apesar de a tarefa de treino (prever a próxima palavra) ser simples, ela produz modelos com capacidades amplas de compreensão e geração de linguagem — diferente dos modelos de NLP tradicionais, que eram feitos sob medida para uma única tarefa.</w:t>
+      </w:r>
+    </w:p>
+    <w:p>
+      <w:pPr>
+        <w:spacing w:before="200" w:after="100"/>
+      </w:pPr>
       <w:r>
         <w:rPr>
           <w:b/>
@@ -130,9 +86,25 @@
           <w:sz w:val="22"/>
           <w:szCs w:val="22"/>
         </w:rPr>
-        <w:t>Language</w:t>
-      </w:r>
-      <w:proofErr w:type="spellEnd"/>
+        <w:t xml:space="preserve">2. Qual a diferença entre IA, Machine Learning e Deep Learning?</w:t>
+      </w:r>
+    </w:p>
+    <w:p>
+      <w:pPr>
+        <w:spacing w:after="200" w:line="276" w:lineRule="auto"/>
+      </w:pPr>
+      <w:r>
+        <w:rPr>
+          <w:sz w:val="22"/>
+          <w:szCs w:val="22"/>
+        </w:rPr>
+        <w:t xml:space="preserve">São camadas concêntricas: IA é o campo mais amplo (sistemas com comportamento "inteligente"); Machine Learning é o subcampo que aprende regras a partir de dados em vez de regras escritas à mão; Deep Learning é um subcampo do ML que usa redes neurais com três ou mais camadas e dispensa a extração manual de features (o modelo aprende sozinho quais características importam). LLMs são uma aplicação específica de Deep Learning.</w:t>
+      </w:r>
+    </w:p>
+    <w:p>
+      <w:pPr>
+        <w:spacing w:before="200" w:after="100"/>
+      </w:pPr>
       <w:r>
         <w:rPr>
           <w:b/>
@@ -141,7 +113,7 @@
           <w:sz w:val="22"/>
           <w:szCs w:val="22"/>
         </w:rPr>
-        <w:t xml:space="preserve"> Model?</w:t>
+        <w:t>3. Como os modelos GPT estão organizados?</w:t>
       </w:r>
     </w:p>
     <w:p>
@@ -153,39 +125,7 @@
           <w:sz w:val="22"/>
           <w:szCs w:val="22"/>
         </w:rPr>
-        <w:t>É uma rede neural profunda treinada em quantidades massivas de texto para prever a próxima palavra em uma sequência. O "</w:t>
-      </w:r>
-      <w:proofErr w:type="spellStart"/>
-      <w:r>
-        <w:rPr>
-          <w:sz w:val="22"/>
-          <w:szCs w:val="22"/>
-        </w:rPr>
-        <w:t>large</w:t>
-      </w:r>
-      <w:proofErr w:type="spellEnd"/>
-      <w:r>
-        <w:rPr>
-          <w:sz w:val="22"/>
-          <w:szCs w:val="22"/>
-        </w:rPr>
-        <w:t xml:space="preserve">" se refere tanto ao número de parâmetros (dezenas a centenas de bilhões) quanto ao tamanho do </w:t>
-      </w:r>
-      <w:proofErr w:type="spellStart"/>
-      <w:r>
-        <w:rPr>
-          <w:sz w:val="22"/>
-          <w:szCs w:val="22"/>
-        </w:rPr>
-        <w:t>dataset</w:t>
-      </w:r>
-      <w:proofErr w:type="spellEnd"/>
-      <w:r>
-        <w:rPr>
-          <w:sz w:val="22"/>
-          <w:szCs w:val="22"/>
-        </w:rPr>
-        <w:t xml:space="preserve"> de treino. Apesar de a tarefa de treino (prever a próxima palavra) ser simples, ela produz modelos com capacidades amplas de compreensão e geração de linguagem — diferente dos modelos de NLP tradicionais, que eram feitos sob medida para uma única tarefa.</w:t>
+        <w:t xml:space="preserve">GPT usa apenas o decoder do Transformer original (que tinha encoder + decoder). É um modelo autorregressivo: gera uma palavra por vez, usando sempre a saída anterior como parte da entrada seguinte, processando o texto de forma unidirecional (esquerda → direita).</w:t>
       </w:r>
     </w:p>
     <w:p>
@@ -200,9 +140,25 @@
           <w:sz w:val="22"/>
           <w:szCs w:val="22"/>
         </w:rPr>
-        <w:t xml:space="preserve">2. Qual a diferença entre IA, Machine Learning e </w:t>
-      </w:r>
-      <w:proofErr w:type="spellStart"/>
+        <w:t>4. Quais são as principais etapas do treinamento de um LLM?</w:t>
+      </w:r>
+    </w:p>
+    <w:p>
+      <w:pPr>
+        <w:spacing w:after="200" w:line="276" w:lineRule="auto"/>
+      </w:pPr>
+      <w:r>
+        <w:rPr>
+          <w:sz w:val="22"/>
+          <w:szCs w:val="22"/>
+        </w:rPr>
+        <w:t xml:space="preserve">1) Pré-treinamento: em um corpus enorme de texto não rotulado (self-supervised learning), prevendo a próxima palavra — resulta no modelo base/foundation model. 2) Fine-tuning: treino adicional em dataset menor e rotulado, podendo ser instruction fine-tuning (pares instrução-resposta) ou classification fine-tuning (texto + rótulo de classe).</w:t>
+      </w:r>
+    </w:p>
+    <w:p>
+      <w:pPr>
+        <w:spacing w:before="200" w:after="100"/>
+      </w:pPr>
       <w:r>
         <w:rPr>
           <w:b/>
@@ -211,9 +167,37 @@
           <w:sz w:val="22"/>
           <w:szCs w:val="22"/>
         </w:rPr>
-        <w:t>Deep</w:t>
-      </w:r>
-      <w:proofErr w:type="spellEnd"/>
+        <w:t>5. Qual é o fluxo geral de funcionamento de um modelo de linguagem?</w:t>
+      </w:r>
+    </w:p>
+    <w:p>
+      <w:pPr>
+        <w:spacing w:after="200" w:line="276" w:lineRule="auto"/>
+      </w:pPr>
+      <w:r>
+        <w:rPr>
+          <w:sz w:val="22"/>
+          <w:szCs w:val="22"/>
+        </w:rPr>
+        <w:t xml:space="preserve">Texto bruto → pré-processamento/tokenização → pré-treinamento (previsão da próxima palavra) → modelo base com capacidades gerais de completude de texto e few-shot → fine-tuning direcionado → modelo especializado (assistente, classificador, etc.), usando o mecanismo de self-attention para ponderar a importância de cada token em relação aos demais.</w:t>
+      </w:r>
+    </w:p>
+    <w:p>
+      <w:pPr>
+        <w:pStyle w:val="Ttulo1"/>
+        <w:pBdr>
+          <w:bottom w:val="single" w:sz="6" w:space="4" w:color="1F4E79"/>
+        </w:pBdr>
+        <w:spacing w:before="400" w:after="200"/>
+      </w:pPr>
+      <w:r>
+        <w:t xml:space="preserve">Apêndice A — Introduction to PyTorch</w:t>
+      </w:r>
+    </w:p>
+    <w:p>
+      <w:pPr>
+        <w:spacing w:before="200" w:after="100"/>
+      </w:pPr>
       <w:r>
         <w:rPr>
           <w:b/>
@@ -222,7 +206,7 @@
           <w:sz w:val="22"/>
           <w:szCs w:val="22"/>
         </w:rPr>
-        <w:t xml:space="preserve"> Learning?</w:t>
+        <w:t xml:space="preserve">1. O que é o PyTorch e quais são seus três componentes principais?</w:t>
       </w:r>
     </w:p>
     <w:p>
@@ -234,55 +218,7 @@
           <w:sz w:val="22"/>
           <w:szCs w:val="22"/>
         </w:rPr>
-        <w:t xml:space="preserve">São camadas concêntricas: IA é o campo mais amplo (sistemas com comportamento "inteligente"); Machine Learning é o subcampo que aprende regras a partir de dados em vez de regras escritas à mão; </w:t>
-      </w:r>
-      <w:proofErr w:type="spellStart"/>
-      <w:r>
-        <w:rPr>
-          <w:sz w:val="22"/>
-          <w:szCs w:val="22"/>
-        </w:rPr>
-        <w:t>Deep</w:t>
-      </w:r>
-      <w:proofErr w:type="spellEnd"/>
-      <w:r>
-        <w:rPr>
-          <w:sz w:val="22"/>
-          <w:szCs w:val="22"/>
-        </w:rPr>
-        <w:t xml:space="preserve"> Learning é um subcampo do ML que usa redes neurais com três ou mais camadas e dispensa a extração manual de features (o modelo aprende sozinho quais características importam). </w:t>
-      </w:r>
-      <w:proofErr w:type="spellStart"/>
-      <w:r>
-        <w:rPr>
-          <w:sz w:val="22"/>
-          <w:szCs w:val="22"/>
-        </w:rPr>
-        <w:t>LLMs</w:t>
-      </w:r>
-      <w:proofErr w:type="spellEnd"/>
-      <w:r>
-        <w:rPr>
-          <w:sz w:val="22"/>
-          <w:szCs w:val="22"/>
-        </w:rPr>
-        <w:t xml:space="preserve"> são uma aplicação específica de </w:t>
-      </w:r>
-      <w:proofErr w:type="spellStart"/>
-      <w:r>
-        <w:rPr>
-          <w:sz w:val="22"/>
-          <w:szCs w:val="22"/>
-        </w:rPr>
-        <w:t>Deep</w:t>
-      </w:r>
-      <w:proofErr w:type="spellEnd"/>
-      <w:r>
-        <w:rPr>
-          <w:sz w:val="22"/>
-          <w:szCs w:val="22"/>
-        </w:rPr>
-        <w:t xml:space="preserve"> Learning.</w:t>
+        <w:t xml:space="preserve">PyTorch é uma biblioteca de deep learning em Python, muito usada em pesquisa. Seus três componentes centrais são: uma biblioteca de tensores (semelhante ao NumPy, com suporte a GPU), um motor de diferenciação automática (autograd) que calcula gradientes, e uma biblioteca de deep learning com blocos prontos — camadas, funções de perda, otimizadores — para construir e treinar modelos.</w:t>
       </w:r>
     </w:p>
     <w:p>
@@ -297,7 +233,7 @@
           <w:sz w:val="22"/>
           <w:szCs w:val="22"/>
         </w:rPr>
-        <w:t>3. Como os modelos GPT estão organizados?</w:t>
+        <w:t xml:space="preserve">2. Como se criam tensores em PyTorch?</w:t>
       </w:r>
     </w:p>
     <w:p>
@@ -309,71 +245,7 @@
           <w:sz w:val="22"/>
           <w:szCs w:val="22"/>
         </w:rPr>
-        <w:t xml:space="preserve">GPT usa apenas o </w:t>
-      </w:r>
-      <w:proofErr w:type="spellStart"/>
-      <w:r>
-        <w:rPr>
-          <w:sz w:val="22"/>
-          <w:szCs w:val="22"/>
-        </w:rPr>
-        <w:t>decoder</w:t>
-      </w:r>
-      <w:proofErr w:type="spellEnd"/>
-      <w:r>
-        <w:rPr>
-          <w:sz w:val="22"/>
-          <w:szCs w:val="22"/>
-        </w:rPr>
-        <w:t xml:space="preserve"> do </w:t>
-      </w:r>
-      <w:proofErr w:type="spellStart"/>
-      <w:r>
-        <w:rPr>
-          <w:sz w:val="22"/>
-          <w:szCs w:val="22"/>
-        </w:rPr>
-        <w:t>Transformer</w:t>
-      </w:r>
-      <w:proofErr w:type="spellEnd"/>
-      <w:r>
-        <w:rPr>
-          <w:sz w:val="22"/>
-          <w:szCs w:val="22"/>
-        </w:rPr>
-        <w:t xml:space="preserve"> original (que tinha </w:t>
-      </w:r>
-      <w:proofErr w:type="spellStart"/>
-      <w:r>
-        <w:rPr>
-          <w:sz w:val="22"/>
-          <w:szCs w:val="22"/>
-        </w:rPr>
-        <w:t>encoder</w:t>
-      </w:r>
-      <w:proofErr w:type="spellEnd"/>
-      <w:r>
-        <w:rPr>
-          <w:sz w:val="22"/>
-          <w:szCs w:val="22"/>
-        </w:rPr>
-        <w:t xml:space="preserve"> + </w:t>
-      </w:r>
-      <w:proofErr w:type="spellStart"/>
-      <w:r>
-        <w:rPr>
-          <w:sz w:val="22"/>
-          <w:szCs w:val="22"/>
-        </w:rPr>
-        <w:t>decoder</w:t>
-      </w:r>
-      <w:proofErr w:type="spellEnd"/>
-      <w:r>
-        <w:rPr>
-          <w:sz w:val="22"/>
-          <w:szCs w:val="22"/>
-        </w:rPr>
-        <w:t>). É um modelo autorregressivo: gera uma palavra por vez, usando sempre a saída anterior como parte da entrada seguinte, processando o texto de forma unidirecional (esquerda → direita).</w:t>
+        <w:t xml:space="preserve">Tensores são criados com torch.tensor(), a partir de números, listas ou listas aninhadas, gerando escalares (0D), vetores (1D), matrizes (2D) ou tensores de dimensões maiores. Inteiros geram tensores int64 por padrão, e floats geram float32; o tipo pode ser alterado com .to().</w:t>
       </w:r>
     </w:p>
     <w:p>
@@ -388,7 +260,7 @@
           <w:sz w:val="22"/>
           <w:szCs w:val="22"/>
         </w:rPr>
-        <w:t>4. Quais são as principais etapas do treinamento de um LLM?</w:t>
+        <w:t xml:space="preserve">3. Quais são as principais operações básicas e de manipulação de dimensões?</w:t>
       </w:r>
     </w:p>
     <w:p>
@@ -400,135 +272,7 @@
           <w:sz w:val="22"/>
           <w:szCs w:val="22"/>
         </w:rPr>
-        <w:t>1) Pré-treinamento: em um corpus enorme de texto não rotulado (self-</w:t>
-      </w:r>
-      <w:proofErr w:type="spellStart"/>
-      <w:r>
-        <w:rPr>
-          <w:sz w:val="22"/>
-          <w:szCs w:val="22"/>
-        </w:rPr>
-        <w:t>supervised</w:t>
-      </w:r>
-      <w:proofErr w:type="spellEnd"/>
-      <w:r>
-        <w:rPr>
-          <w:sz w:val="22"/>
-          <w:szCs w:val="22"/>
-        </w:rPr>
-        <w:t xml:space="preserve"> learning), prevendo a próxima palavra — resulta no modelo base/</w:t>
-      </w:r>
-      <w:proofErr w:type="spellStart"/>
-      <w:r>
-        <w:rPr>
-          <w:sz w:val="22"/>
-          <w:szCs w:val="22"/>
-        </w:rPr>
-        <w:t>foundation</w:t>
-      </w:r>
-      <w:proofErr w:type="spellEnd"/>
-      <w:r>
-        <w:rPr>
-          <w:sz w:val="22"/>
-          <w:szCs w:val="22"/>
-        </w:rPr>
-        <w:t xml:space="preserve"> model. 2) Fine-</w:t>
-      </w:r>
-      <w:proofErr w:type="spellStart"/>
-      <w:r>
-        <w:rPr>
-          <w:sz w:val="22"/>
-          <w:szCs w:val="22"/>
-        </w:rPr>
-        <w:t>tuning</w:t>
-      </w:r>
-      <w:proofErr w:type="spellEnd"/>
-      <w:r>
-        <w:rPr>
-          <w:sz w:val="22"/>
-          <w:szCs w:val="22"/>
-        </w:rPr>
-        <w:t xml:space="preserve">: treino adicional em </w:t>
-      </w:r>
-      <w:proofErr w:type="spellStart"/>
-      <w:r>
-        <w:rPr>
-          <w:sz w:val="22"/>
-          <w:szCs w:val="22"/>
-        </w:rPr>
-        <w:t>dataset</w:t>
-      </w:r>
-      <w:proofErr w:type="spellEnd"/>
-      <w:r>
-        <w:rPr>
-          <w:sz w:val="22"/>
-          <w:szCs w:val="22"/>
-        </w:rPr>
-        <w:t xml:space="preserve"> menor e rotulado, podendo ser </w:t>
-      </w:r>
-      <w:proofErr w:type="spellStart"/>
-      <w:r>
-        <w:rPr>
-          <w:sz w:val="22"/>
-          <w:szCs w:val="22"/>
-        </w:rPr>
-        <w:t>instruction</w:t>
-      </w:r>
-      <w:proofErr w:type="spellEnd"/>
-      <w:r>
-        <w:rPr>
-          <w:sz w:val="22"/>
-          <w:szCs w:val="22"/>
-        </w:rPr>
-        <w:t xml:space="preserve"> fine-</w:t>
-      </w:r>
-      <w:proofErr w:type="spellStart"/>
-      <w:r>
-        <w:rPr>
-          <w:sz w:val="22"/>
-          <w:szCs w:val="22"/>
-        </w:rPr>
-        <w:t>tuning</w:t>
-      </w:r>
-      <w:proofErr w:type="spellEnd"/>
-      <w:r>
-        <w:rPr>
-          <w:sz w:val="22"/>
-          <w:szCs w:val="22"/>
-        </w:rPr>
-        <w:t xml:space="preserve"> (pares instrução-resposta) ou </w:t>
-      </w:r>
-      <w:proofErr w:type="spellStart"/>
-      <w:r>
-        <w:rPr>
-          <w:sz w:val="22"/>
-          <w:szCs w:val="22"/>
-        </w:rPr>
-        <w:t>classification</w:t>
-      </w:r>
-      <w:proofErr w:type="spellEnd"/>
-      <w:r>
-        <w:rPr>
-          <w:sz w:val="22"/>
-          <w:szCs w:val="22"/>
-        </w:rPr>
-        <w:t xml:space="preserve"> fine-</w:t>
-      </w:r>
-      <w:proofErr w:type="spellStart"/>
-      <w:r>
-        <w:rPr>
-          <w:sz w:val="22"/>
-          <w:szCs w:val="22"/>
-        </w:rPr>
-        <w:t>tuning</w:t>
-      </w:r>
-      <w:proofErr w:type="spellEnd"/>
-      <w:r>
-        <w:rPr>
-          <w:sz w:val="22"/>
-          <w:szCs w:val="22"/>
-        </w:rPr>
-        <w:t xml:space="preserve"> (texto + rótulo de classe).</w:t>
+        <w:t xml:space="preserve">.shape mostra o formato do tensor; .reshape() e .view() alteram esse formato (view exige dados contíguos na memória, reshape sempre funciona, copiando os dados se necessário); .T transpõe o tensor, invertendo linhas e colunas.</w:t>
       </w:r>
     </w:p>
     <w:p>
@@ -543,7 +287,7 @@
           <w:sz w:val="22"/>
           <w:szCs w:val="22"/>
         </w:rPr>
-        <w:t>5. Qual é o fluxo geral de funcionamento de um modelo de linguagem?</w:t>
+        <w:t xml:space="preserve">4. Como funcionam as operações matriciais em PyTorch?</w:t>
       </w:r>
     </w:p>
     <w:p>
@@ -555,71 +299,61 @@
           <w:sz w:val="22"/>
           <w:szCs w:val="22"/>
         </w:rPr>
-        <w:t xml:space="preserve">Texto bruto → pré-processamento/tokenização → pré-treinamento (previsão da próxima palavra) → modelo base com capacidades gerais de completude de texto e </w:t>
-      </w:r>
-      <w:proofErr w:type="spellStart"/>
-      <w:r>
-        <w:rPr>
-          <w:sz w:val="22"/>
-          <w:szCs w:val="22"/>
-        </w:rPr>
-        <w:t>few</w:t>
-      </w:r>
-      <w:proofErr w:type="spellEnd"/>
-      <w:r>
-        <w:rPr>
-          <w:sz w:val="22"/>
-          <w:szCs w:val="22"/>
-        </w:rPr>
-        <w:t>-shot → fine-</w:t>
-      </w:r>
-      <w:proofErr w:type="spellStart"/>
-      <w:r>
-        <w:rPr>
-          <w:sz w:val="22"/>
-          <w:szCs w:val="22"/>
-        </w:rPr>
-        <w:t>tuning</w:t>
-      </w:r>
-      <w:proofErr w:type="spellEnd"/>
-      <w:r>
-        <w:rPr>
-          <w:sz w:val="22"/>
-          <w:szCs w:val="22"/>
-        </w:rPr>
-        <w:t xml:space="preserve"> direcionado → modelo especializado (assistente, </w:t>
-      </w:r>
-      <w:proofErr w:type="gramStart"/>
-      <w:r>
-        <w:rPr>
-          <w:sz w:val="22"/>
-          <w:szCs w:val="22"/>
-        </w:rPr>
-        <w:t>classificador, etc.</w:t>
-      </w:r>
-      <w:proofErr w:type="gramEnd"/>
-      <w:r>
-        <w:rPr>
-          <w:sz w:val="22"/>
-          <w:szCs w:val="22"/>
-        </w:rPr>
-        <w:t>), usando o mecanismo de self-</w:t>
-      </w:r>
-      <w:proofErr w:type="spellStart"/>
-      <w:r>
-        <w:rPr>
-          <w:sz w:val="22"/>
-          <w:szCs w:val="22"/>
-        </w:rPr>
-        <w:t>attention</w:t>
-      </w:r>
-      <w:proofErr w:type="spellEnd"/>
-      <w:r>
-        <w:rPr>
-          <w:sz w:val="22"/>
-          <w:szCs w:val="22"/>
-        </w:rPr>
-        <w:t xml:space="preserve"> para ponderar a importância de cada token em relação aos demais.</w:t>
+        <w:t xml:space="preserve">A multiplicação de matrizes é feita com o método .matmul() ou, de forma equivalente e mais compacta, com o operador @.</w:t>
+      </w:r>
+    </w:p>
+    <w:p>
+      <w:pPr>
+        <w:spacing w:before="200" w:after="100"/>
+      </w:pPr>
+      <w:r>
+        <w:rPr>
+          <w:b/>
+          <w:bCs/>
+          <w:color w:val="1F4E79"/>
+          <w:sz w:val="22"/>
+          <w:szCs w:val="22"/>
+        </w:rPr>
+        <w:t xml:space="preserve">5. Como funciona o autograd (diferenciação automática)?</w:t>
+      </w:r>
+    </w:p>
+    <w:p>
+      <w:pPr>
+        <w:spacing w:after="200" w:line="276" w:lineRule="auto"/>
+      </w:pPr>
+      <w:r>
+        <w:rPr>
+          <w:sz w:val="22"/>
+          <w:szCs w:val="22"/>
+        </w:rPr>
+        <w:t xml:space="preserve">O PyTorch monta um grafo computacional internamente sempre que um tensor tem requires_grad=True. Ao chamar loss.backward(), ele aplica a regra da cadeia automaticamente e calcula o gradiente de cada parâmetro, armazenado no atributo .grad — sem que seja preciso derivar nada manualmente.</w:t>
+      </w:r>
+    </w:p>
+    <w:p>
+      <w:pPr>
+        <w:spacing w:before="200" w:after="100"/>
+      </w:pPr>
+      <w:r>
+        <w:rPr>
+          <w:b/>
+          <w:bCs/>
+          <w:color w:val="1F4E79"/>
+          <w:sz w:val="22"/>
+          <w:szCs w:val="22"/>
+        </w:rPr>
+        <w:t xml:space="preserve">6. Como se constroem modelos usando os módulos do PyTorch?</w:t>
+      </w:r>
+    </w:p>
+    <w:p>
+      <w:pPr>
+        <w:spacing w:after="200" w:line="276" w:lineRule="auto"/>
+      </w:pPr>
+      <w:r>
+        <w:rPr>
+          <w:sz w:val="22"/>
+          <w:szCs w:val="22"/>
+        </w:rPr>
+        <w:t xml:space="preserve">Modelos são criados como subclasses de torch.nn.Module, definindo as camadas no __init__ (ex.: torch.nn.Linear, torch.nn.ReLU, organizadas com Sequential) e o fluxo de dados no método forward. O treinamento usa um otimizador (ex.: SGD): a cada lote, zera-se o gradiente (zero_grad), calcula-se a perda, chama-se loss.backward() e atualiza-se os pesos com optimizer.step().</w:t>
       </w:r>
     </w:p>
     <w:p>

</xml_diff>